<commit_message>
Add feedback page to Hot Wash run of show
Co-Authored-By: Claude Opus 5.5 <noreply@anthropic.com>
Claude-Session: https://claude.ai/code/session_01H8RzR8Vqx1nz4TKSD8z8pm
</commit_message>
<xml_diff>
--- a/hotwash/1500_Gateway_Hot_Wash_Run_of_Show.docx
+++ b/hotwash/1500_Gateway_Hot_Wash_Run_of_Show.docx
@@ -2566,6 +2566,671 @@
         <w:t xml:space="preserve">Winner's fee terms and tracking data are not in these materials. Ben and John to supply.</w:t>
       </w:r>
     </w:p>
+    <w:p>
+      <w:r>
+        <w:br w:type="page"/>
+      </w:r>
+    </w:p>
+    <w:p>
+      <w:pPr>
+        <w:pStyle w:val="Heading1"/>
+      </w:pPr>
+      <w:r>
+        <w:t xml:space="preserve">Your feedback</w:t>
+      </w:r>
+    </w:p>
+    <w:p>
+      <w:pPr>
+        <w:spacing w:after="120"/>
+      </w:pPr>
+      <w:r>
+        <w:t xml:space="preserve">Write your name and at least one positive and one negative from 1500 Gateway or from this session. Be specific: what happened, and what it changed.</w:t>
+      </w:r>
+    </w:p>
+    <w:tbl>
+      <w:tblPr>
+        <w:tblW w:type="dxa" w:w="9360"/>
+        <w:tblBorders>
+          <w:top w:val="single" w:color="auto" w:sz="4"/>
+          <w:left w:val="single" w:color="auto" w:sz="4"/>
+          <w:bottom w:val="single" w:color="auto" w:sz="4"/>
+          <w:right w:val="single" w:color="auto" w:sz="4"/>
+          <w:insideH w:val="single" w:color="auto" w:sz="4"/>
+          <w:insideV w:val="single" w:color="auto" w:sz="4"/>
+        </w:tblBorders>
+      </w:tblPr>
+      <w:tblGrid>
+        <w:gridCol w:w="1960"/>
+        <w:gridCol w:w="3700"/>
+        <w:gridCol w:w="3700"/>
+      </w:tblGrid>
+      <w:tr>
+        <w:trPr>
+          <w:tblHeader/>
+        </w:trPr>
+        <w:tc>
+          <w:tcPr>
+            <w:tcW w:type="dxa" w:w="1960"/>
+            <w:tcBorders>
+              <w:top w:val="single" w:color="BFBFBF" w:sz="4"/>
+              <w:left w:val="single" w:color="BFBFBF" w:sz="4"/>
+              <w:bottom w:val="single" w:color="BFBFBF" w:sz="4"/>
+              <w:right w:val="single" w:color="BFBFBF" w:sz="4"/>
+            </w:tcBorders>
+            <w:shd w:fill="E8ECF2" w:color="auto" w:val="clear"/>
+            <w:tcMar>
+              <w:top w:type="dxa" w:w="80"/>
+              <w:left w:type="dxa" w:w="120"/>
+              <w:bottom w:type="dxa" w:w="80"/>
+              <w:right w:type="dxa" w:w="120"/>
+            </w:tcMar>
+          </w:tcPr>
+          <w:p>
+            <w:r>
+              <w:rPr>
+                <w:b/>
+                <w:bCs/>
+              </w:rPr>
+              <w:t xml:space="preserve">Name</w:t>
+            </w:r>
+          </w:p>
+        </w:tc>
+        <w:tc>
+          <w:tcPr>
+            <w:tcW w:type="dxa" w:w="3700"/>
+            <w:tcBorders>
+              <w:top w:val="single" w:color="BFBFBF" w:sz="4"/>
+              <w:left w:val="single" w:color="BFBFBF" w:sz="4"/>
+              <w:bottom w:val="single" w:color="BFBFBF" w:sz="4"/>
+              <w:right w:val="single" w:color="BFBFBF" w:sz="4"/>
+            </w:tcBorders>
+            <w:shd w:fill="E8ECF2" w:color="auto" w:val="clear"/>
+            <w:tcMar>
+              <w:top w:type="dxa" w:w="80"/>
+              <w:left w:type="dxa" w:w="120"/>
+              <w:bottom w:type="dxa" w:w="80"/>
+              <w:right w:type="dxa" w:w="120"/>
+            </w:tcMar>
+          </w:tcPr>
+          <w:p>
+            <w:r>
+              <w:rPr>
+                <w:b/>
+                <w:bCs/>
+              </w:rPr>
+              <w:t xml:space="preserve">Positives: what worked</w:t>
+            </w:r>
+          </w:p>
+        </w:tc>
+        <w:tc>
+          <w:tcPr>
+            <w:tcW w:type="dxa" w:w="3700"/>
+            <w:tcBorders>
+              <w:top w:val="single" w:color="BFBFBF" w:sz="4"/>
+              <w:left w:val="single" w:color="BFBFBF" w:sz="4"/>
+              <w:bottom w:val="single" w:color="BFBFBF" w:sz="4"/>
+              <w:right w:val="single" w:color="BFBFBF" w:sz="4"/>
+            </w:tcBorders>
+            <w:shd w:fill="E8ECF2" w:color="auto" w:val="clear"/>
+            <w:tcMar>
+              <w:top w:type="dxa" w:w="80"/>
+              <w:left w:type="dxa" w:w="120"/>
+              <w:bottom w:type="dxa" w:w="80"/>
+              <w:right w:type="dxa" w:w="120"/>
+            </w:tcMar>
+          </w:tcPr>
+          <w:p>
+            <w:r>
+              <w:rPr>
+                <w:b/>
+                <w:bCs/>
+              </w:rPr>
+              <w:t xml:space="preserve">Negatives: what didn't</w:t>
+            </w:r>
+          </w:p>
+        </w:tc>
+      </w:tr>
+      <w:tr>
+        <w:trPr>
+          <w:cantSplit/>
+          <w:trHeight w:val="1300" w:hRule="atLeast"/>
+        </w:trPr>
+        <w:tc>
+          <w:tcPr>
+            <w:tcW w:type="dxa" w:w="1960"/>
+            <w:tcBorders>
+              <w:top w:val="single" w:color="BFBFBF" w:sz="4"/>
+              <w:left w:val="single" w:color="BFBFBF" w:sz="4"/>
+              <w:bottom w:val="single" w:color="BFBFBF" w:sz="4"/>
+              <w:right w:val="single" w:color="BFBFBF" w:sz="4"/>
+            </w:tcBorders>
+            <w:tcMar>
+              <w:top w:type="dxa" w:w="80"/>
+              <w:left w:type="dxa" w:w="120"/>
+              <w:bottom w:type="dxa" w:w="80"/>
+              <w:right w:type="dxa" w:w="120"/>
+            </w:tcMar>
+          </w:tcPr>
+          <w:p/>
+        </w:tc>
+        <w:tc>
+          <w:tcPr>
+            <w:tcW w:type="dxa" w:w="3700"/>
+            <w:tcBorders>
+              <w:top w:val="single" w:color="BFBFBF" w:sz="4"/>
+              <w:left w:val="single" w:color="BFBFBF" w:sz="4"/>
+              <w:bottom w:val="single" w:color="BFBFBF" w:sz="4"/>
+              <w:right w:val="single" w:color="BFBFBF" w:sz="4"/>
+            </w:tcBorders>
+            <w:tcMar>
+              <w:top w:type="dxa" w:w="80"/>
+              <w:left w:type="dxa" w:w="120"/>
+              <w:bottom w:type="dxa" w:w="80"/>
+              <w:right w:type="dxa" w:w="120"/>
+            </w:tcMar>
+          </w:tcPr>
+          <w:p/>
+        </w:tc>
+        <w:tc>
+          <w:tcPr>
+            <w:tcW w:type="dxa" w:w="3700"/>
+            <w:tcBorders>
+              <w:top w:val="single" w:color="BFBFBF" w:sz="4"/>
+              <w:left w:val="single" w:color="BFBFBF" w:sz="4"/>
+              <w:bottom w:val="single" w:color="BFBFBF" w:sz="4"/>
+              <w:right w:val="single" w:color="BFBFBF" w:sz="4"/>
+            </w:tcBorders>
+            <w:tcMar>
+              <w:top w:type="dxa" w:w="80"/>
+              <w:left w:type="dxa" w:w="120"/>
+              <w:bottom w:type="dxa" w:w="80"/>
+              <w:right w:type="dxa" w:w="120"/>
+            </w:tcMar>
+          </w:tcPr>
+          <w:p/>
+        </w:tc>
+      </w:tr>
+      <w:tr>
+        <w:trPr>
+          <w:cantSplit/>
+          <w:trHeight w:val="1300" w:hRule="atLeast"/>
+        </w:trPr>
+        <w:tc>
+          <w:tcPr>
+            <w:tcW w:type="dxa" w:w="1960"/>
+            <w:tcBorders>
+              <w:top w:val="single" w:color="BFBFBF" w:sz="4"/>
+              <w:left w:val="single" w:color="BFBFBF" w:sz="4"/>
+              <w:bottom w:val="single" w:color="BFBFBF" w:sz="4"/>
+              <w:right w:val="single" w:color="BFBFBF" w:sz="4"/>
+            </w:tcBorders>
+            <w:tcMar>
+              <w:top w:type="dxa" w:w="80"/>
+              <w:left w:type="dxa" w:w="120"/>
+              <w:bottom w:type="dxa" w:w="80"/>
+              <w:right w:type="dxa" w:w="120"/>
+            </w:tcMar>
+          </w:tcPr>
+          <w:p/>
+        </w:tc>
+        <w:tc>
+          <w:tcPr>
+            <w:tcW w:type="dxa" w:w="3700"/>
+            <w:tcBorders>
+              <w:top w:val="single" w:color="BFBFBF" w:sz="4"/>
+              <w:left w:val="single" w:color="BFBFBF" w:sz="4"/>
+              <w:bottom w:val="single" w:color="BFBFBF" w:sz="4"/>
+              <w:right w:val="single" w:color="BFBFBF" w:sz="4"/>
+            </w:tcBorders>
+            <w:tcMar>
+              <w:top w:type="dxa" w:w="80"/>
+              <w:left w:type="dxa" w:w="120"/>
+              <w:bottom w:type="dxa" w:w="80"/>
+              <w:right w:type="dxa" w:w="120"/>
+            </w:tcMar>
+          </w:tcPr>
+          <w:p/>
+        </w:tc>
+        <w:tc>
+          <w:tcPr>
+            <w:tcW w:type="dxa" w:w="3700"/>
+            <w:tcBorders>
+              <w:top w:val="single" w:color="BFBFBF" w:sz="4"/>
+              <w:left w:val="single" w:color="BFBFBF" w:sz="4"/>
+              <w:bottom w:val="single" w:color="BFBFBF" w:sz="4"/>
+              <w:right w:val="single" w:color="BFBFBF" w:sz="4"/>
+            </w:tcBorders>
+            <w:tcMar>
+              <w:top w:type="dxa" w:w="80"/>
+              <w:left w:type="dxa" w:w="120"/>
+              <w:bottom w:type="dxa" w:w="80"/>
+              <w:right w:type="dxa" w:w="120"/>
+            </w:tcMar>
+          </w:tcPr>
+          <w:p/>
+        </w:tc>
+      </w:tr>
+      <w:tr>
+        <w:trPr>
+          <w:cantSplit/>
+          <w:trHeight w:val="1300" w:hRule="atLeast"/>
+        </w:trPr>
+        <w:tc>
+          <w:tcPr>
+            <w:tcW w:type="dxa" w:w="1960"/>
+            <w:tcBorders>
+              <w:top w:val="single" w:color="BFBFBF" w:sz="4"/>
+              <w:left w:val="single" w:color="BFBFBF" w:sz="4"/>
+              <w:bottom w:val="single" w:color="BFBFBF" w:sz="4"/>
+              <w:right w:val="single" w:color="BFBFBF" w:sz="4"/>
+            </w:tcBorders>
+            <w:tcMar>
+              <w:top w:type="dxa" w:w="80"/>
+              <w:left w:type="dxa" w:w="120"/>
+              <w:bottom w:type="dxa" w:w="80"/>
+              <w:right w:type="dxa" w:w="120"/>
+            </w:tcMar>
+          </w:tcPr>
+          <w:p/>
+        </w:tc>
+        <w:tc>
+          <w:tcPr>
+            <w:tcW w:type="dxa" w:w="3700"/>
+            <w:tcBorders>
+              <w:top w:val="single" w:color="BFBFBF" w:sz="4"/>
+              <w:left w:val="single" w:color="BFBFBF" w:sz="4"/>
+              <w:bottom w:val="single" w:color="BFBFBF" w:sz="4"/>
+              <w:right w:val="single" w:color="BFBFBF" w:sz="4"/>
+            </w:tcBorders>
+            <w:tcMar>
+              <w:top w:type="dxa" w:w="80"/>
+              <w:left w:type="dxa" w:w="120"/>
+              <w:bottom w:type="dxa" w:w="80"/>
+              <w:right w:type="dxa" w:w="120"/>
+            </w:tcMar>
+          </w:tcPr>
+          <w:p/>
+        </w:tc>
+        <w:tc>
+          <w:tcPr>
+            <w:tcW w:type="dxa" w:w="3700"/>
+            <w:tcBorders>
+              <w:top w:val="single" w:color="BFBFBF" w:sz="4"/>
+              <w:left w:val="single" w:color="BFBFBF" w:sz="4"/>
+              <w:bottom w:val="single" w:color="BFBFBF" w:sz="4"/>
+              <w:right w:val="single" w:color="BFBFBF" w:sz="4"/>
+            </w:tcBorders>
+            <w:tcMar>
+              <w:top w:type="dxa" w:w="80"/>
+              <w:left w:type="dxa" w:w="120"/>
+              <w:bottom w:type="dxa" w:w="80"/>
+              <w:right w:type="dxa" w:w="120"/>
+            </w:tcMar>
+          </w:tcPr>
+          <w:p/>
+        </w:tc>
+      </w:tr>
+      <w:tr>
+        <w:trPr>
+          <w:cantSplit/>
+          <w:trHeight w:val="1300" w:hRule="atLeast"/>
+        </w:trPr>
+        <w:tc>
+          <w:tcPr>
+            <w:tcW w:type="dxa" w:w="1960"/>
+            <w:tcBorders>
+              <w:top w:val="single" w:color="BFBFBF" w:sz="4"/>
+              <w:left w:val="single" w:color="BFBFBF" w:sz="4"/>
+              <w:bottom w:val="single" w:color="BFBFBF" w:sz="4"/>
+              <w:right w:val="single" w:color="BFBFBF" w:sz="4"/>
+            </w:tcBorders>
+            <w:tcMar>
+              <w:top w:type="dxa" w:w="80"/>
+              <w:left w:type="dxa" w:w="120"/>
+              <w:bottom w:type="dxa" w:w="80"/>
+              <w:right w:type="dxa" w:w="120"/>
+            </w:tcMar>
+          </w:tcPr>
+          <w:p/>
+        </w:tc>
+        <w:tc>
+          <w:tcPr>
+            <w:tcW w:type="dxa" w:w="3700"/>
+            <w:tcBorders>
+              <w:top w:val="single" w:color="BFBFBF" w:sz="4"/>
+              <w:left w:val="single" w:color="BFBFBF" w:sz="4"/>
+              <w:bottom w:val="single" w:color="BFBFBF" w:sz="4"/>
+              <w:right w:val="single" w:color="BFBFBF" w:sz="4"/>
+            </w:tcBorders>
+            <w:tcMar>
+              <w:top w:type="dxa" w:w="80"/>
+              <w:left w:type="dxa" w:w="120"/>
+              <w:bottom w:type="dxa" w:w="80"/>
+              <w:right w:type="dxa" w:w="120"/>
+            </w:tcMar>
+          </w:tcPr>
+          <w:p/>
+        </w:tc>
+        <w:tc>
+          <w:tcPr>
+            <w:tcW w:type="dxa" w:w="3700"/>
+            <w:tcBorders>
+              <w:top w:val="single" w:color="BFBFBF" w:sz="4"/>
+              <w:left w:val="single" w:color="BFBFBF" w:sz="4"/>
+              <w:bottom w:val="single" w:color="BFBFBF" w:sz="4"/>
+              <w:right w:val="single" w:color="BFBFBF" w:sz="4"/>
+            </w:tcBorders>
+            <w:tcMar>
+              <w:top w:type="dxa" w:w="80"/>
+              <w:left w:type="dxa" w:w="120"/>
+              <w:bottom w:type="dxa" w:w="80"/>
+              <w:right w:type="dxa" w:w="120"/>
+            </w:tcMar>
+          </w:tcPr>
+          <w:p/>
+        </w:tc>
+      </w:tr>
+      <w:tr>
+        <w:trPr>
+          <w:cantSplit/>
+          <w:trHeight w:val="1300" w:hRule="atLeast"/>
+        </w:trPr>
+        <w:tc>
+          <w:tcPr>
+            <w:tcW w:type="dxa" w:w="1960"/>
+            <w:tcBorders>
+              <w:top w:val="single" w:color="BFBFBF" w:sz="4"/>
+              <w:left w:val="single" w:color="BFBFBF" w:sz="4"/>
+              <w:bottom w:val="single" w:color="BFBFBF" w:sz="4"/>
+              <w:right w:val="single" w:color="BFBFBF" w:sz="4"/>
+            </w:tcBorders>
+            <w:tcMar>
+              <w:top w:type="dxa" w:w="80"/>
+              <w:left w:type="dxa" w:w="120"/>
+              <w:bottom w:type="dxa" w:w="80"/>
+              <w:right w:type="dxa" w:w="120"/>
+            </w:tcMar>
+          </w:tcPr>
+          <w:p/>
+        </w:tc>
+        <w:tc>
+          <w:tcPr>
+            <w:tcW w:type="dxa" w:w="3700"/>
+            <w:tcBorders>
+              <w:top w:val="single" w:color="BFBFBF" w:sz="4"/>
+              <w:left w:val="single" w:color="BFBFBF" w:sz="4"/>
+              <w:bottom w:val="single" w:color="BFBFBF" w:sz="4"/>
+              <w:right w:val="single" w:color="BFBFBF" w:sz="4"/>
+            </w:tcBorders>
+            <w:tcMar>
+              <w:top w:type="dxa" w:w="80"/>
+              <w:left w:type="dxa" w:w="120"/>
+              <w:bottom w:type="dxa" w:w="80"/>
+              <w:right w:type="dxa" w:w="120"/>
+            </w:tcMar>
+          </w:tcPr>
+          <w:p/>
+        </w:tc>
+        <w:tc>
+          <w:tcPr>
+            <w:tcW w:type="dxa" w:w="3700"/>
+            <w:tcBorders>
+              <w:top w:val="single" w:color="BFBFBF" w:sz="4"/>
+              <w:left w:val="single" w:color="BFBFBF" w:sz="4"/>
+              <w:bottom w:val="single" w:color="BFBFBF" w:sz="4"/>
+              <w:right w:val="single" w:color="BFBFBF" w:sz="4"/>
+            </w:tcBorders>
+            <w:tcMar>
+              <w:top w:type="dxa" w:w="80"/>
+              <w:left w:type="dxa" w:w="120"/>
+              <w:bottom w:type="dxa" w:w="80"/>
+              <w:right w:type="dxa" w:w="120"/>
+            </w:tcMar>
+          </w:tcPr>
+          <w:p/>
+        </w:tc>
+      </w:tr>
+      <w:tr>
+        <w:trPr>
+          <w:cantSplit/>
+          <w:trHeight w:val="1300" w:hRule="atLeast"/>
+        </w:trPr>
+        <w:tc>
+          <w:tcPr>
+            <w:tcW w:type="dxa" w:w="1960"/>
+            <w:tcBorders>
+              <w:top w:val="single" w:color="BFBFBF" w:sz="4"/>
+              <w:left w:val="single" w:color="BFBFBF" w:sz="4"/>
+              <w:bottom w:val="single" w:color="BFBFBF" w:sz="4"/>
+              <w:right w:val="single" w:color="BFBFBF" w:sz="4"/>
+            </w:tcBorders>
+            <w:tcMar>
+              <w:top w:type="dxa" w:w="80"/>
+              <w:left w:type="dxa" w:w="120"/>
+              <w:bottom w:type="dxa" w:w="80"/>
+              <w:right w:type="dxa" w:w="120"/>
+            </w:tcMar>
+          </w:tcPr>
+          <w:p/>
+        </w:tc>
+        <w:tc>
+          <w:tcPr>
+            <w:tcW w:type="dxa" w:w="3700"/>
+            <w:tcBorders>
+              <w:top w:val="single" w:color="BFBFBF" w:sz="4"/>
+              <w:left w:val="single" w:color="BFBFBF" w:sz="4"/>
+              <w:bottom w:val="single" w:color="BFBFBF" w:sz="4"/>
+              <w:right w:val="single" w:color="BFBFBF" w:sz="4"/>
+            </w:tcBorders>
+            <w:tcMar>
+              <w:top w:type="dxa" w:w="80"/>
+              <w:left w:type="dxa" w:w="120"/>
+              <w:bottom w:type="dxa" w:w="80"/>
+              <w:right w:type="dxa" w:w="120"/>
+            </w:tcMar>
+          </w:tcPr>
+          <w:p/>
+        </w:tc>
+        <w:tc>
+          <w:tcPr>
+            <w:tcW w:type="dxa" w:w="3700"/>
+            <w:tcBorders>
+              <w:top w:val="single" w:color="BFBFBF" w:sz="4"/>
+              <w:left w:val="single" w:color="BFBFBF" w:sz="4"/>
+              <w:bottom w:val="single" w:color="BFBFBF" w:sz="4"/>
+              <w:right w:val="single" w:color="BFBFBF" w:sz="4"/>
+            </w:tcBorders>
+            <w:tcMar>
+              <w:top w:type="dxa" w:w="80"/>
+              <w:left w:type="dxa" w:w="120"/>
+              <w:bottom w:type="dxa" w:w="80"/>
+              <w:right w:type="dxa" w:w="120"/>
+            </w:tcMar>
+          </w:tcPr>
+          <w:p/>
+        </w:tc>
+      </w:tr>
+      <w:tr>
+        <w:trPr>
+          <w:cantSplit/>
+          <w:trHeight w:val="1300" w:hRule="atLeast"/>
+        </w:trPr>
+        <w:tc>
+          <w:tcPr>
+            <w:tcW w:type="dxa" w:w="1960"/>
+            <w:tcBorders>
+              <w:top w:val="single" w:color="BFBFBF" w:sz="4"/>
+              <w:left w:val="single" w:color="BFBFBF" w:sz="4"/>
+              <w:bottom w:val="single" w:color="BFBFBF" w:sz="4"/>
+              <w:right w:val="single" w:color="BFBFBF" w:sz="4"/>
+            </w:tcBorders>
+            <w:tcMar>
+              <w:top w:type="dxa" w:w="80"/>
+              <w:left w:type="dxa" w:w="120"/>
+              <w:bottom w:type="dxa" w:w="80"/>
+              <w:right w:type="dxa" w:w="120"/>
+            </w:tcMar>
+          </w:tcPr>
+          <w:p/>
+        </w:tc>
+        <w:tc>
+          <w:tcPr>
+            <w:tcW w:type="dxa" w:w="3700"/>
+            <w:tcBorders>
+              <w:top w:val="single" w:color="BFBFBF" w:sz="4"/>
+              <w:left w:val="single" w:color="BFBFBF" w:sz="4"/>
+              <w:bottom w:val="single" w:color="BFBFBF" w:sz="4"/>
+              <w:right w:val="single" w:color="BFBFBF" w:sz="4"/>
+            </w:tcBorders>
+            <w:tcMar>
+              <w:top w:type="dxa" w:w="80"/>
+              <w:left w:type="dxa" w:w="120"/>
+              <w:bottom w:type="dxa" w:w="80"/>
+              <w:right w:type="dxa" w:w="120"/>
+            </w:tcMar>
+          </w:tcPr>
+          <w:p/>
+        </w:tc>
+        <w:tc>
+          <w:tcPr>
+            <w:tcW w:type="dxa" w:w="3700"/>
+            <w:tcBorders>
+              <w:top w:val="single" w:color="BFBFBF" w:sz="4"/>
+              <w:left w:val="single" w:color="BFBFBF" w:sz="4"/>
+              <w:bottom w:val="single" w:color="BFBFBF" w:sz="4"/>
+              <w:right w:val="single" w:color="BFBFBF" w:sz="4"/>
+            </w:tcBorders>
+            <w:tcMar>
+              <w:top w:type="dxa" w:w="80"/>
+              <w:left w:type="dxa" w:w="120"/>
+              <w:bottom w:type="dxa" w:w="80"/>
+              <w:right w:type="dxa" w:w="120"/>
+            </w:tcMar>
+          </w:tcPr>
+          <w:p/>
+        </w:tc>
+      </w:tr>
+      <w:tr>
+        <w:trPr>
+          <w:cantSplit/>
+          <w:trHeight w:val="1300" w:hRule="atLeast"/>
+        </w:trPr>
+        <w:tc>
+          <w:tcPr>
+            <w:tcW w:type="dxa" w:w="1960"/>
+            <w:tcBorders>
+              <w:top w:val="single" w:color="BFBFBF" w:sz="4"/>
+              <w:left w:val="single" w:color="BFBFBF" w:sz="4"/>
+              <w:bottom w:val="single" w:color="BFBFBF" w:sz="4"/>
+              <w:right w:val="single" w:color="BFBFBF" w:sz="4"/>
+            </w:tcBorders>
+            <w:tcMar>
+              <w:top w:type="dxa" w:w="80"/>
+              <w:left w:type="dxa" w:w="120"/>
+              <w:bottom w:type="dxa" w:w="80"/>
+              <w:right w:type="dxa" w:w="120"/>
+            </w:tcMar>
+          </w:tcPr>
+          <w:p/>
+        </w:tc>
+        <w:tc>
+          <w:tcPr>
+            <w:tcW w:type="dxa" w:w="3700"/>
+            <w:tcBorders>
+              <w:top w:val="single" w:color="BFBFBF" w:sz="4"/>
+              <w:left w:val="single" w:color="BFBFBF" w:sz="4"/>
+              <w:bottom w:val="single" w:color="BFBFBF" w:sz="4"/>
+              <w:right w:val="single" w:color="BFBFBF" w:sz="4"/>
+            </w:tcBorders>
+            <w:tcMar>
+              <w:top w:type="dxa" w:w="80"/>
+              <w:left w:type="dxa" w:w="120"/>
+              <w:bottom w:type="dxa" w:w="80"/>
+              <w:right w:type="dxa" w:w="120"/>
+            </w:tcMar>
+          </w:tcPr>
+          <w:p/>
+        </w:tc>
+        <w:tc>
+          <w:tcPr>
+            <w:tcW w:type="dxa" w:w="3700"/>
+            <w:tcBorders>
+              <w:top w:val="single" w:color="BFBFBF" w:sz="4"/>
+              <w:left w:val="single" w:color="BFBFBF" w:sz="4"/>
+              <w:bottom w:val="single" w:color="BFBFBF" w:sz="4"/>
+              <w:right w:val="single" w:color="BFBFBF" w:sz="4"/>
+            </w:tcBorders>
+            <w:tcMar>
+              <w:top w:type="dxa" w:w="80"/>
+              <w:left w:type="dxa" w:w="120"/>
+              <w:bottom w:type="dxa" w:w="80"/>
+              <w:right w:type="dxa" w:w="120"/>
+            </w:tcMar>
+          </w:tcPr>
+          <w:p/>
+        </w:tc>
+      </w:tr>
+      <w:tr>
+        <w:trPr>
+          <w:cantSplit/>
+          <w:trHeight w:val="1300" w:hRule="atLeast"/>
+        </w:trPr>
+        <w:tc>
+          <w:tcPr>
+            <w:tcW w:type="dxa" w:w="1960"/>
+            <w:tcBorders>
+              <w:top w:val="single" w:color="BFBFBF" w:sz="4"/>
+              <w:left w:val="single" w:color="BFBFBF" w:sz="4"/>
+              <w:bottom w:val="single" w:color="BFBFBF" w:sz="4"/>
+              <w:right w:val="single" w:color="BFBFBF" w:sz="4"/>
+            </w:tcBorders>
+            <w:tcMar>
+              <w:top w:type="dxa" w:w="80"/>
+              <w:left w:type="dxa" w:w="120"/>
+              <w:bottom w:type="dxa" w:w="80"/>
+              <w:right w:type="dxa" w:w="120"/>
+            </w:tcMar>
+          </w:tcPr>
+          <w:p/>
+        </w:tc>
+        <w:tc>
+          <w:tcPr>
+            <w:tcW w:type="dxa" w:w="3700"/>
+            <w:tcBorders>
+              <w:top w:val="single" w:color="BFBFBF" w:sz="4"/>
+              <w:left w:val="single" w:color="BFBFBF" w:sz="4"/>
+              <w:bottom w:val="single" w:color="BFBFBF" w:sz="4"/>
+              <w:right w:val="single" w:color="BFBFBF" w:sz="4"/>
+            </w:tcBorders>
+            <w:tcMar>
+              <w:top w:type="dxa" w:w="80"/>
+              <w:left w:type="dxa" w:w="120"/>
+              <w:bottom w:type="dxa" w:w="80"/>
+              <w:right w:type="dxa" w:w="120"/>
+            </w:tcMar>
+          </w:tcPr>
+          <w:p/>
+        </w:tc>
+        <w:tc>
+          <w:tcPr>
+            <w:tcW w:type="dxa" w:w="3700"/>
+            <w:tcBorders>
+              <w:top w:val="single" w:color="BFBFBF" w:sz="4"/>
+              <w:left w:val="single" w:color="BFBFBF" w:sz="4"/>
+              <w:bottom w:val="single" w:color="BFBFBF" w:sz="4"/>
+              <w:right w:val="single" w:color="BFBFBF" w:sz="4"/>
+            </w:tcBorders>
+            <w:tcMar>
+              <w:top w:type="dxa" w:w="80"/>
+              <w:left w:type="dxa" w:w="120"/>
+              <w:bottom w:type="dxa" w:w="80"/>
+              <w:right w:type="dxa" w:w="120"/>
+            </w:tcMar>
+          </w:tcPr>
+          <w:p/>
+        </w:tc>
+      </w:tr>
+    </w:tbl>
     <w:sectPr>
       <w:footerReference w:type="default" r:id="rId6"/>
       <w:pgSz w:w="12240" w:h="15840" w:orient="portrait"/>

</xml_diff>